<commit_message>
docs: update all documentation and screenshots for v2.0 premium redesign
- Capture fresh authenticated screenshots for all 18 module pages
- Update landing page screenshots (dashboard, projects, sales, rentals, maintenance, finance)
- Update Business Documentation v2.0: premium design system, Lucide icons, semantic colors
- Update Technical White Paper v1.0→v2.0: design system, component library, icon migration
- Update all 17 User Guide DOCX files: version bump, design references, embedded screenshots
- Add new screenshots: reports, sales-overview
- Remove all references to Glass Morphism, Phosphor Icons, old version numbers
</commit_message>
<xml_diff>
--- a/docs/Mimaric-Business-Documentation-v2.0.docx
+++ b/docs/Mimaric-Business-Documentation-v2.0.docx
@@ -3728,7 +3728,7 @@
                     <w:rStyle w:val="Hyperlink"/>
                     <w:noProof/>
                   </w:rPr>
-                  <w:t>17. Glass Morphism Design System</w:t>
+                  <w:t>17. Premium Design System</w:t>
                 </w:r>
                 <w:r>
                   <w:rPr>
@@ -4248,7 +4248,7 @@
                     <w:rStyle w:val="Hyperlink"/>
                     <w:noProof/>
                   </w:rPr>
-                  <w:t>22. Current Platform (v1.2.0)</w:t>
+                  <w:t>22. Current Platform (v2.0.0)</w:t>
                 </w:r>
                 <w:r>
                   <w:rPr>
@@ -15575,7 +15575,7 @@
       </w:pPr>
       <w:bookmarkStart w:id="47" w:name="_Toc224688179"/>
       <w:r>
-        <w:t>17. Glass Morphism Design System</w:t>
+        <w:t>17. Premium Design System</w:t>
       </w:r>
       <w:bookmarkEnd w:id="47"/>
     </w:p>
@@ -15587,7 +15587,7 @@
         <w:rPr>
           <w:color w:val="4A5568"/>
         </w:rPr>
-        <w:t>Mimaric uses a modern glass morphism design language that creates a premium, professional aesthetic:</w:t>
+        <w:t>Mimaric uses a modern premium dark-mode-first design language that creates a premium, professional aesthetic:</w:t>
       </w:r>
     </w:p>
     <w:p>
@@ -15608,7 +15608,7 @@
         <w:rPr>
           <w:color w:val="4A5568"/>
         </w:rPr>
-        <w:t>Layered glass-effect UI with backdrop blur and semi-transparent backgrounds</w:t>
+        <w:t>Layered surface design with semantic color tokens and subtle contrast differences</w:t>
       </w:r>
     </w:p>
     <w:p>
@@ -15640,7 +15640,7 @@
         <w:rPr>
           <w:color w:val="4A5568"/>
         </w:rPr>
-        <w:t>Glow accents in green and gold for interactive elements</w:t>
+        <w:t>Semantic accent colors (primary purple, success green, warning amber, danger red) for status and actions</w:t>
       </w:r>
     </w:p>
     <w:p>
@@ -15672,7 +15672,7 @@
         <w:rPr>
           <w:color w:val="4A5568"/>
         </w:rPr>
-        <w:t>Full dark mode support with dedicated overrides for all UI elements</w:t>
+        <w:t>Dark-mode-first design with full light mode support, using layered surfaces rather than heavy shadows</w:t>
       </w:r>
     </w:p>
     <w:p>
@@ -15704,7 +15704,7 @@
         <w:rPr>
           <w:color w:val="4A5568"/>
         </w:rPr>
-        <w:t>The design system includes a comprehensive color palette, button system with hover-lift effects, status badges, and consistent iconography through Phosphor Icons.</w:t>
+        <w:t>The design system includes a comprehensive color palette, button system with subtle hover transitions, status badges, and consistent iconography through Lucide Icons.</w:t>
       </w:r>
     </w:p>
     <w:p>
@@ -16978,7 +16978,7 @@
       </w:pPr>
       <w:bookmarkStart w:id="54" w:name="_Toc224688186"/>
       <w:r>
-        <w:t>22. Current Platform (v1.2.0)</w:t>
+        <w:t>22. Current Platform (v2.0.0)</w:t>
       </w:r>
       <w:bookmarkEnd w:id="54"/>
     </w:p>
@@ -16990,7 +16990,7 @@
         <w:rPr>
           <w:color w:val="4A5568"/>
         </w:rPr>
-        <w:t>Mimaric v1.2.0 delivers a comprehensive platform with the following capabilities:</w:t>
+        <w:t>Mimaric v2.0.0 delivers a comprehensive platform with the following capabilities:</w:t>
       </w:r>
     </w:p>
     <w:p>

</xml_diff>